<commit_message>
docs: done Section 1 and 2
</commit_message>
<xml_diff>
--- a/SRS/Student-Attendance-Management-System-SRS.docx
+++ b/SRS/Student-Attendance-Management-System-SRS.docx
@@ -5681,18 +5681,27 @@
     <w:p xmlns:wp14="http://schemas.microsoft.com/office/word/2010/wordml" wp14:textId="1E835006">
       <w:pPr>
         <w:pStyle w:val="Heading2"/>
+        <w:rPr>
+          <w:rFonts w:ascii="Times New Roman" w:hAnsi="Times New Roman" w:eastAsia="Times New Roman" w:cs="Times New Roman"/>
+          <w:b w:val="1"/>
+          <w:bCs w:val="1"/>
+        </w:rPr>
       </w:pPr>
       <w:bookmarkStart w:name="_heading=h.rzfjb6b1l8mo" w:id="6"/>
       <w:bookmarkEnd w:id="6"/>
       <w:r>
         <w:rPr>
           <w:rFonts w:ascii="Times New Roman" w:hAnsi="Times New Roman" w:eastAsia="Times New Roman" w:cs="Times New Roman"/>
+          <w:b w:val="1"/>
+          <w:bCs w:val="1"/>
         </w:rPr>
         <w:t>References</w:t>
       </w:r>
       <w:r>
         <w:rPr>
           <w:rFonts w:ascii="Times New Roman" w:hAnsi="Times New Roman" w:eastAsia="Times New Roman" w:cs="Times New Roman"/>
+          <w:b w:val="1"/>
+          <w:bCs w:val="1"/>
         </w:rPr>
         <w:t>(Temp)</w:t>
       </w:r>
@@ -5850,12 +5859,19 @@
     <w:p xmlns:wp14="http://schemas.microsoft.com/office/word/2010/wordml" wp14:textId="67F08041">
       <w:pPr>
         <w:pStyle w:val="Heading1"/>
+        <w:rPr>
+          <w:rFonts w:ascii="Times New Roman" w:hAnsi="Times New Roman" w:eastAsia="Times New Roman" w:cs="Times New Roman"/>
+          <w:b w:val="1"/>
+          <w:bCs w:val="1"/>
+        </w:rPr>
       </w:pPr>
       <w:bookmarkStart w:name="_heading=h.2uyfv1cr0vhz" w:id="7"/>
       <w:bookmarkEnd w:id="7"/>
       <w:r>
         <w:rPr>
           <w:rFonts w:ascii="Times New Roman" w:hAnsi="Times New Roman" w:eastAsia="Times New Roman" w:cs="Times New Roman"/>
+          <w:b w:val="1"/>
+          <w:bCs w:val="1"/>
         </w:rPr>
         <w:t>Overall Description</w:t>
       </w:r>
@@ -5863,385 +5879,1370 @@
     <w:p xmlns:wp14="http://schemas.microsoft.com/office/word/2010/wordml" wp14:textId="77777777">
       <w:pPr>
         <w:pStyle w:val="Heading2"/>
-        <w:rPr/>
+        <w:rPr>
+          <w:rFonts w:ascii="Times New Roman" w:hAnsi="Times New Roman" w:eastAsia="Times New Roman" w:cs="Times New Roman"/>
+          <w:b w:val="1"/>
+          <w:bCs w:val="1"/>
+        </w:rPr>
       </w:pPr>
       <w:bookmarkStart w:name="_heading=h.qu3o45p25iu1" w:id="8"/>
       <w:bookmarkEnd w:id="8"/>
       <w:r>
         <w:rPr>
           <w:rFonts w:ascii="Times New Roman" w:hAnsi="Times New Roman" w:eastAsia="Times New Roman" w:cs="Times New Roman"/>
+          <w:b w:val="1"/>
+          <w:bCs w:val="1"/>
         </w:rPr>
         <w:t>Product Perspective</w:t>
       </w:r>
     </w:p>
-    <w:p xmlns:wp14="http://schemas.microsoft.com/office/word/2010/wordml" wp14:textId="77777777">
+    <w:p>
+      <w:pPr>
+        <w:spacing w:before="240" w:beforeAutospacing="off" w:after="240" w:afterAutospacing="off"/>
+        <w:rPr>
+          <w:rFonts w:ascii="Arial" w:hAnsi="Arial" w:eastAsia="Arial" w:cs="Arial" w:asciiTheme="minorAscii" w:hAnsiTheme="minorAscii" w:eastAsiaTheme="minorAscii" w:cstheme="minorAscii"/>
+          <w:noProof w:val="0"/>
+          <w:sz w:val="22"/>
+          <w:szCs w:val="22"/>
+          <w:lang w:val="en-US"/>
+        </w:rPr>
+      </w:pPr>
+      <w:r>
+        <w:rPr>
+          <w:rFonts w:ascii="Arial" w:hAnsi="Arial" w:eastAsia="Arial" w:cs="Arial" w:asciiTheme="minorAscii" w:hAnsiTheme="minorAscii" w:eastAsiaTheme="minorAscii" w:cstheme="minorAscii"/>
+          <w:noProof w:val="0"/>
+          <w:sz w:val="22"/>
+          <w:szCs w:val="22"/>
+          <w:lang w:val="en-US"/>
+        </w:rPr>
+        <w:t>The Student Attendance Management System is a new, self-contained software system developed to automate and simplify the management of student attendance. It provides a centralized platform for managing student information, recording attendance, viewing attendance records, and generating attendance reports. The system consists of user interfaces, application logic, and a database for storing and retrieving attendance-related information. The system is intended to reduce the dependence on manual attendance records and improve the accuracy and accessibility of attendance information.</w:t>
+      </w:r>
+    </w:p>
+    <w:p>
       <w:pPr>
         <w:pStyle w:val="normal1"/>
-        <w:keepNext w:val="false"/>
-        <w:keepLines w:val="false"/>
-        <w:pageBreakBefore w:val="false"/>
-        <w:widowControl/>
-        <w:pBdr/>
-        <w:shd w:val="clear" w:fill="auto"/>
+        <w:keepNext w:val="0"/>
+        <w:keepLines w:val="0"/>
+        <w:pageBreakBefore w:val="0"/>
+        <w:widowControl w:val="1"/>
+        <w:shd w:val="clear" w:color="auto" w:fill="auto"/>
         <w:spacing w:before="0" w:after="0" w:line="240" w:lineRule="auto"/>
-        <w:ind w:start="0" w:end="0" w:hanging="0"/>
+        <w:ind w:hanging="0"/>
         <w:jc w:val="both"/>
         <w:rPr>
           <w:rFonts w:ascii="Times New Roman" w:hAnsi="Times New Roman" w:eastAsia="Times New Roman" w:cs="Times New Roman"/>
-          <w:i/>
-          <w:iCs/>
-          <w:caps w:val="false"/>
-          <w:smallCaps w:val="false"/>
-          <w:strike w:val="false"/>
-          <w:dstrike w:val="false"/>
-          <w:color w:val="000000"/>
-          <w:position w:val="0"/>
+          <w:i w:val="1"/>
+          <w:iCs w:val="1"/>
+          <w:caps w:val="0"/>
+          <w:smallCaps w:val="0"/>
+          <w:strike w:val="0"/>
+          <w:dstrike w:val="0"/>
+          <w:color w:val="000000" w:themeColor="text2" w:themeTint="FF" w:themeShade="FF"/>
           <w:sz w:val="22"/>
           <w:szCs w:val="22"/>
           <w:u w:val="none"/>
-          <w:shd w:val="clear" w:fill="auto"/>
           <w:vertAlign w:val="baseline"/>
         </w:rPr>
       </w:pPr>
-      <w:r>
-        <w:rPr>
-          <w:rFonts w:ascii="Times New Roman" w:hAnsi="Times New Roman" w:eastAsia="Times New Roman" w:cs="Times New Roman"/>
-          <w:i/>
-          <w:iCs/>
-          <w:caps w:val="false"/>
-          <w:smallCaps w:val="false"/>
-          <w:strike w:val="false"/>
-          <w:dstrike w:val="false"/>
-          <w:color w:val="000000"/>
-          <w:position w:val="0"/>
+    </w:p>
+    <w:p>
+      <w:pPr>
+        <w:pStyle w:val="Heading2"/>
+        <w:rPr>
+          <w:rFonts w:ascii="Times New Roman" w:hAnsi="Times New Roman" w:eastAsia="Times New Roman" w:cs="Times New Roman"/>
+          <w:b w:val="1"/>
+          <w:bCs w:val="1"/>
+        </w:rPr>
+      </w:pPr>
+      <w:bookmarkStart w:name="_heading=h.avrui7g8fa24" w:id="9"/>
+      <w:bookmarkEnd w:id="9"/>
+      <w:r>
+        <w:rPr>
+          <w:rFonts w:ascii="Times New Roman" w:hAnsi="Times New Roman" w:eastAsia="Times New Roman" w:cs="Times New Roman"/>
+          <w:b w:val="1"/>
+          <w:bCs w:val="1"/>
+        </w:rPr>
+        <w:t>Product Functions</w:t>
+      </w:r>
+    </w:p>
+    <w:p>
+      <w:pPr>
+        <w:pStyle w:val="Heading2"/>
+        <w:rPr>
+          <w:rFonts w:ascii="Arial" w:hAnsi="Arial" w:eastAsia="Arial" w:cs="Arial" w:asciiTheme="minorAscii" w:hAnsiTheme="minorAscii" w:eastAsiaTheme="minorAscii" w:cstheme="minorAscii"/>
+          <w:noProof w:val="0"/>
+          <w:color w:val="auto"/>
+          <w:sz w:val="22"/>
+          <w:szCs w:val="22"/>
+          <w:lang w:val="en-US"/>
+        </w:rPr>
+      </w:pPr>
+      <w:r>
+        <w:rPr>
+          <w:rFonts w:ascii="Arial" w:hAnsi="Arial" w:eastAsia="Arial" w:cs="Arial" w:asciiTheme="minorAscii" w:hAnsiTheme="minorAscii" w:eastAsiaTheme="minorAscii" w:cstheme="minorAscii"/>
+          <w:noProof w:val="0"/>
+          <w:color w:val="auto"/>
+          <w:sz w:val="22"/>
+          <w:szCs w:val="22"/>
+          <w:lang w:val="en-US"/>
+        </w:rPr>
+        <w:t>The major functions of the Student Attendance Management System include:</w:t>
+      </w:r>
+    </w:p>
+    <w:p>
+      <w:pPr>
+        <w:pStyle w:val="ListParagraph"/>
+        <w:numPr>
+          <w:ilvl w:val="0"/>
+          <w:numId w:val="2"/>
+        </w:numPr>
+        <w:spacing w:before="0" w:beforeAutospacing="off" w:after="0" w:afterAutospacing="off"/>
+        <w:rPr>
+          <w:rFonts w:ascii="Arial" w:hAnsi="Arial" w:eastAsia="Arial" w:cs="Arial" w:asciiTheme="minorAscii" w:hAnsiTheme="minorAscii" w:eastAsiaTheme="minorAscii" w:cstheme="minorAscii"/>
+          <w:noProof w:val="0"/>
+          <w:sz w:val="22"/>
+          <w:szCs w:val="22"/>
+          <w:lang w:val="en-US"/>
+        </w:rPr>
+      </w:pPr>
+      <w:r>
+        <w:rPr>
+          <w:rFonts w:ascii="Arial" w:hAnsi="Arial" w:eastAsia="Arial" w:cs="Arial" w:asciiTheme="minorAscii" w:hAnsiTheme="minorAscii" w:eastAsiaTheme="minorAscii" w:cstheme="minorAscii"/>
+          <w:noProof w:val="0"/>
+          <w:sz w:val="22"/>
+          <w:szCs w:val="22"/>
+          <w:lang w:val="en-US"/>
+        </w:rPr>
+        <w:t xml:space="preserve">User authentication and role-based access. </w:t>
+      </w:r>
+    </w:p>
+    <w:p>
+      <w:pPr>
+        <w:pStyle w:val="ListParagraph"/>
+        <w:numPr>
+          <w:ilvl w:val="0"/>
+          <w:numId w:val="2"/>
+        </w:numPr>
+        <w:spacing w:before="0" w:beforeAutospacing="off" w:after="0" w:afterAutospacing="off"/>
+        <w:rPr>
+          <w:rFonts w:ascii="Arial" w:hAnsi="Arial" w:eastAsia="Arial" w:cs="Arial" w:asciiTheme="minorAscii" w:hAnsiTheme="minorAscii" w:eastAsiaTheme="minorAscii" w:cstheme="minorAscii"/>
+          <w:noProof w:val="0"/>
+          <w:sz w:val="22"/>
+          <w:szCs w:val="22"/>
+          <w:lang w:val="en-US"/>
+        </w:rPr>
+      </w:pPr>
+      <w:r>
+        <w:rPr>
+          <w:rFonts w:ascii="Arial" w:hAnsi="Arial" w:eastAsia="Arial" w:cs="Arial" w:asciiTheme="minorAscii" w:hAnsiTheme="minorAscii" w:eastAsiaTheme="minorAscii" w:cstheme="minorAscii"/>
+          <w:noProof w:val="0"/>
+          <w:sz w:val="22"/>
+          <w:szCs w:val="22"/>
+          <w:lang w:val="en-US"/>
+        </w:rPr>
+        <w:t xml:space="preserve">Student information management. </w:t>
+      </w:r>
+    </w:p>
+    <w:p>
+      <w:pPr>
+        <w:pStyle w:val="ListParagraph"/>
+        <w:numPr>
+          <w:ilvl w:val="0"/>
+          <w:numId w:val="2"/>
+        </w:numPr>
+        <w:spacing w:before="0" w:beforeAutospacing="off" w:after="0" w:afterAutospacing="off"/>
+        <w:rPr>
+          <w:rFonts w:ascii="Arial" w:hAnsi="Arial" w:eastAsia="Arial" w:cs="Arial" w:asciiTheme="minorAscii" w:hAnsiTheme="minorAscii" w:eastAsiaTheme="minorAscii" w:cstheme="minorAscii"/>
+          <w:noProof w:val="0"/>
+          <w:sz w:val="22"/>
+          <w:szCs w:val="22"/>
+          <w:lang w:val="en-US"/>
+        </w:rPr>
+      </w:pPr>
+      <w:r>
+        <w:rPr>
+          <w:rFonts w:ascii="Arial" w:hAnsi="Arial" w:eastAsia="Arial" w:cs="Arial" w:asciiTheme="minorAscii" w:hAnsiTheme="minorAscii" w:eastAsiaTheme="minorAscii" w:cstheme="minorAscii"/>
+          <w:noProof w:val="0"/>
+          <w:sz w:val="22"/>
+          <w:szCs w:val="22"/>
+          <w:lang w:val="en-US"/>
+        </w:rPr>
+        <w:t xml:space="preserve">Faculty and class/course management. </w:t>
+      </w:r>
+    </w:p>
+    <w:p>
+      <w:pPr>
+        <w:pStyle w:val="ListParagraph"/>
+        <w:numPr>
+          <w:ilvl w:val="0"/>
+          <w:numId w:val="2"/>
+        </w:numPr>
+        <w:spacing w:before="0" w:beforeAutospacing="off" w:after="0" w:afterAutospacing="off"/>
+        <w:rPr>
+          <w:rFonts w:ascii="Arial" w:hAnsi="Arial" w:eastAsia="Arial" w:cs="Arial" w:asciiTheme="minorAscii" w:hAnsiTheme="minorAscii" w:eastAsiaTheme="minorAscii" w:cstheme="minorAscii"/>
+          <w:noProof w:val="0"/>
+          <w:sz w:val="22"/>
+          <w:szCs w:val="22"/>
+          <w:lang w:val="en-US"/>
+        </w:rPr>
+      </w:pPr>
+      <w:r>
+        <w:rPr>
+          <w:rFonts w:ascii="Arial" w:hAnsi="Arial" w:eastAsia="Arial" w:cs="Arial" w:asciiTheme="minorAscii" w:hAnsiTheme="minorAscii" w:eastAsiaTheme="minorAscii" w:cstheme="minorAscii"/>
+          <w:noProof w:val="0"/>
+          <w:sz w:val="22"/>
+          <w:szCs w:val="22"/>
+          <w:lang w:val="en-US"/>
+        </w:rPr>
+        <w:t xml:space="preserve">Recording and managing student attendance. </w:t>
+      </w:r>
+    </w:p>
+    <w:p>
+      <w:pPr>
+        <w:pStyle w:val="ListParagraph"/>
+        <w:numPr>
+          <w:ilvl w:val="0"/>
+          <w:numId w:val="2"/>
+        </w:numPr>
+        <w:spacing w:before="0" w:beforeAutospacing="off" w:after="0" w:afterAutospacing="off"/>
+        <w:rPr>
+          <w:rFonts w:ascii="Arial" w:hAnsi="Arial" w:eastAsia="Arial" w:cs="Arial" w:asciiTheme="minorAscii" w:hAnsiTheme="minorAscii" w:eastAsiaTheme="minorAscii" w:cstheme="minorAscii"/>
+          <w:noProof w:val="0"/>
+          <w:sz w:val="22"/>
+          <w:szCs w:val="22"/>
+          <w:lang w:val="en-US"/>
+        </w:rPr>
+      </w:pPr>
+      <w:r>
+        <w:rPr>
+          <w:rFonts w:ascii="Arial" w:hAnsi="Arial" w:eastAsia="Arial" w:cs="Arial" w:asciiTheme="minorAscii" w:hAnsiTheme="minorAscii" w:eastAsiaTheme="minorAscii" w:cstheme="minorAscii"/>
+          <w:noProof w:val="0"/>
+          <w:sz w:val="22"/>
+          <w:szCs w:val="22"/>
+          <w:lang w:val="en-US"/>
+        </w:rPr>
+        <w:t xml:space="preserve">Viewing attendance records and attendance percentage. </w:t>
+      </w:r>
+    </w:p>
+    <w:p>
+      <w:pPr>
+        <w:pStyle w:val="ListParagraph"/>
+        <w:numPr>
+          <w:ilvl w:val="0"/>
+          <w:numId w:val="2"/>
+        </w:numPr>
+        <w:spacing w:before="0" w:beforeAutospacing="off" w:after="0" w:afterAutospacing="off"/>
+        <w:rPr>
+          <w:rFonts w:ascii="Arial" w:hAnsi="Arial" w:eastAsia="Arial" w:cs="Arial" w:asciiTheme="minorAscii" w:hAnsiTheme="minorAscii" w:eastAsiaTheme="minorAscii" w:cstheme="minorAscii"/>
+          <w:noProof w:val="0"/>
+          <w:sz w:val="22"/>
+          <w:szCs w:val="22"/>
+          <w:lang w:val="en-US"/>
+        </w:rPr>
+      </w:pPr>
+      <w:r>
+        <w:rPr>
+          <w:rFonts w:ascii="Arial" w:hAnsi="Arial" w:eastAsia="Arial" w:cs="Arial" w:asciiTheme="minorAscii" w:hAnsiTheme="minorAscii" w:eastAsiaTheme="minorAscii" w:cstheme="minorAscii"/>
+          <w:noProof w:val="0"/>
+          <w:sz w:val="22"/>
+          <w:szCs w:val="22"/>
+          <w:lang w:val="en-US"/>
+        </w:rPr>
+        <w:t xml:space="preserve">Generating attendance reports. </w:t>
+      </w:r>
+    </w:p>
+    <w:p>
+      <w:pPr>
+        <w:pStyle w:val="ListParagraph"/>
+        <w:numPr>
+          <w:ilvl w:val="0"/>
+          <w:numId w:val="2"/>
+        </w:numPr>
+        <w:spacing w:before="0" w:beforeAutospacing="off" w:after="0" w:afterAutospacing="off"/>
+        <w:rPr>
+          <w:rFonts w:ascii="Arial" w:hAnsi="Arial" w:eastAsia="Arial" w:cs="Arial" w:asciiTheme="minorAscii" w:hAnsiTheme="minorAscii" w:eastAsiaTheme="minorAscii" w:cstheme="minorAscii"/>
+          <w:noProof w:val="0"/>
+          <w:sz w:val="22"/>
+          <w:szCs w:val="22"/>
+          <w:lang w:val="en-US"/>
+        </w:rPr>
+      </w:pPr>
+      <w:r>
+        <w:rPr>
+          <w:rFonts w:ascii="Arial" w:hAnsi="Arial" w:eastAsia="Arial" w:cs="Arial" w:asciiTheme="minorAscii" w:hAnsiTheme="minorAscii" w:eastAsiaTheme="minorAscii" w:cstheme="minorAscii"/>
+          <w:noProof w:val="0"/>
+          <w:sz w:val="22"/>
+          <w:szCs w:val="22"/>
+          <w:lang w:val="en-US"/>
+        </w:rPr>
+        <w:t xml:space="preserve">Managing authorized attendance corrections. </w:t>
+      </w:r>
+    </w:p>
+    <w:p>
+      <w:pPr>
+        <w:pStyle w:val="ListParagraph"/>
+        <w:numPr>
+          <w:ilvl w:val="0"/>
+          <w:numId w:val="2"/>
+        </w:numPr>
+        <w:spacing w:before="0" w:beforeAutospacing="off" w:after="0" w:afterAutospacing="off"/>
+        <w:rPr>
+          <w:rFonts w:ascii="Arial" w:hAnsi="Arial" w:eastAsia="Arial" w:cs="Arial" w:asciiTheme="minorAscii" w:hAnsiTheme="minorAscii" w:eastAsiaTheme="minorAscii" w:cstheme="minorAscii"/>
+          <w:noProof w:val="0"/>
+          <w:sz w:val="22"/>
+          <w:szCs w:val="22"/>
+          <w:lang w:val="en-US"/>
+        </w:rPr>
+      </w:pPr>
+      <w:r>
+        <w:rPr>
+          <w:rFonts w:ascii="Arial" w:hAnsi="Arial" w:eastAsia="Arial" w:cs="Arial" w:asciiTheme="minorAscii" w:hAnsiTheme="minorAscii" w:eastAsiaTheme="minorAscii" w:cstheme="minorAscii"/>
+          <w:noProof w:val="0"/>
+          <w:sz w:val="22"/>
+          <w:szCs w:val="22"/>
+          <w:lang w:val="en-US"/>
+        </w:rPr>
+        <w:t>Providing role-specific information through dashboards.</w:t>
+      </w:r>
+    </w:p>
+    <w:p>
+      <w:pPr>
+        <w:pStyle w:val="normal1"/>
+        <w:keepNext w:val="0"/>
+        <w:keepLines w:val="0"/>
+        <w:pageBreakBefore w:val="0"/>
+        <w:widowControl w:val="1"/>
+        <w:shd w:val="clear" w:color="auto" w:fill="auto"/>
+        <w:spacing w:before="0" w:after="0" w:line="240" w:lineRule="auto"/>
+        <w:ind w:hanging="0"/>
+        <w:jc w:val="both"/>
+        <w:rPr>
+          <w:rFonts w:ascii="Times New Roman" w:hAnsi="Times New Roman" w:eastAsia="Times New Roman" w:cs="Times New Roman"/>
+          <w:i w:val="1"/>
+          <w:iCs w:val="1"/>
+          <w:caps w:val="0"/>
+          <w:smallCaps w:val="0"/>
+          <w:strike w:val="0"/>
+          <w:dstrike w:val="0"/>
+          <w:color w:val="000000" w:themeColor="text2" w:themeTint="FF" w:themeShade="FF"/>
           <w:sz w:val="22"/>
           <w:szCs w:val="22"/>
           <w:u w:val="none"/>
-          <w:shd w:val="clear" w:fill="auto"/>
           <w:vertAlign w:val="baseline"/>
         </w:rPr>
-        <w:t>&lt;Describe the context and origin of the product being specified in this SRS. For example, state whether this product is a follow-on member of a product family, a replacement for certain existing systems, or a new, self-contained product. If the SRS defines a component of a larger system, relate the requirements of the larger system to the functionality of this software and identify interfaces between the two. A simple diagram that shows the major components of the overall system, subsystem interconnections, and external interfaces can be helpful.&gt;</w:t>
-      </w:r>
-    </w:p>
-    <w:p xmlns:wp14="http://schemas.microsoft.com/office/word/2010/wordml" wp14:textId="77777777">
+      </w:pPr>
+    </w:p>
+    <w:p>
       <w:pPr>
         <w:pStyle w:val="Heading2"/>
-        <w:rPr/>
-      </w:pPr>
-      <w:bookmarkStart w:name="_heading=h.avrui7g8fa24" w:id="9"/>
-      <w:bookmarkEnd w:id="9"/>
-      <w:r>
-        <w:rPr>
-          <w:rFonts w:ascii="Times New Roman" w:hAnsi="Times New Roman" w:eastAsia="Times New Roman" w:cs="Times New Roman"/>
-        </w:rPr>
-        <w:t>Product Functions</w:t>
-      </w:r>
-    </w:p>
-    <w:p xmlns:wp14="http://schemas.microsoft.com/office/word/2010/wordml" wp14:textId="77777777">
+        <w:rPr>
+          <w:rFonts w:ascii="Times New Roman" w:hAnsi="Times New Roman" w:eastAsia="Times New Roman" w:cs="Times New Roman"/>
+          <w:b w:val="1"/>
+          <w:bCs w:val="1"/>
+        </w:rPr>
+      </w:pPr>
+      <w:bookmarkStart w:name="_heading=h.u6kjbwmryldc" w:id="10"/>
+      <w:bookmarkEnd w:id="10"/>
+      <w:r>
+        <w:rPr>
+          <w:rFonts w:ascii="Times New Roman" w:hAnsi="Times New Roman" w:eastAsia="Times New Roman" w:cs="Times New Roman"/>
+          <w:b w:val="1"/>
+          <w:bCs w:val="1"/>
+        </w:rPr>
+        <w:t>User Classes and Characteristics</w:t>
+      </w:r>
+    </w:p>
+    <w:p>
+      <w:pPr>
+        <w:pStyle w:val="Heading2"/>
+      </w:pPr>
+      <w:r>
+        <w:rPr>
+          <w:rFonts w:ascii="Arial" w:hAnsi="Arial" w:eastAsia="Arial" w:cs="Arial" w:asciiTheme="minorAscii" w:hAnsiTheme="minorAscii" w:eastAsiaTheme="minorAscii" w:cstheme="minorAscii"/>
+          <w:noProof w:val="0"/>
+          <w:color w:val="auto"/>
+          <w:sz w:val="22"/>
+          <w:szCs w:val="22"/>
+          <w:lang w:val="en-US"/>
+        </w:rPr>
+        <w:t>The system will support the following user classes:</w:t>
+      </w:r>
+    </w:p>
+    <w:p>
+      <w:pPr>
+        <w:pStyle w:val="Heading2"/>
+        <w:rPr>
+          <w:rFonts w:ascii="Arial" w:hAnsi="Arial" w:eastAsia="Arial" w:cs="Arial" w:asciiTheme="minorAscii" w:hAnsiTheme="minorAscii" w:eastAsiaTheme="minorAscii" w:cstheme="minorAscii"/>
+          <w:noProof w:val="0"/>
+          <w:color w:val="auto"/>
+          <w:sz w:val="22"/>
+          <w:szCs w:val="22"/>
+          <w:lang w:val="en-US"/>
+        </w:rPr>
+      </w:pPr>
+      <w:r>
+        <w:rPr>
+          <w:rFonts w:ascii="Arial" w:hAnsi="Arial" w:eastAsia="Arial" w:cs="Arial" w:asciiTheme="minorAscii" w:hAnsiTheme="minorAscii" w:eastAsiaTheme="minorAscii" w:cstheme="minorAscii"/>
+          <w:b w:val="1"/>
+          <w:bCs w:val="1"/>
+          <w:noProof w:val="0"/>
+          <w:color w:val="auto"/>
+          <w:sz w:val="22"/>
+          <w:szCs w:val="22"/>
+          <w:lang w:val="en-US"/>
+        </w:rPr>
+        <w:t>1. Administrator:</w:t>
+      </w:r>
+      <w:r>
+        <w:br/>
+      </w:r>
+      <w:r>
+        <w:rPr>
+          <w:rFonts w:ascii="Arial" w:hAnsi="Arial" w:eastAsia="Arial" w:cs="Arial" w:asciiTheme="minorAscii" w:hAnsiTheme="minorAscii" w:eastAsiaTheme="minorAscii" w:cstheme="minorAscii"/>
+          <w:noProof w:val="0"/>
+          <w:color w:val="auto"/>
+          <w:sz w:val="22"/>
+          <w:szCs w:val="22"/>
+          <w:lang w:val="en-US"/>
+        </w:rPr>
+        <w:t xml:space="preserve"> The administrator manages system-level information, including student, faculty, and course/class records. The administrator has the highest level of access to system management functions.</w:t>
+      </w:r>
+    </w:p>
+    <w:p>
+      <w:pPr>
+        <w:spacing w:before="240" w:beforeAutospacing="off" w:after="240" w:afterAutospacing="off"/>
+        <w:rPr>
+          <w:rFonts w:ascii="Arial" w:hAnsi="Arial" w:eastAsia="Arial" w:cs="Arial" w:asciiTheme="minorAscii" w:hAnsiTheme="minorAscii" w:eastAsiaTheme="minorAscii" w:cstheme="minorAscii"/>
+          <w:noProof w:val="0"/>
+          <w:sz w:val="22"/>
+          <w:szCs w:val="22"/>
+          <w:lang w:val="en-US"/>
+        </w:rPr>
+      </w:pPr>
+      <w:r>
+        <w:rPr>
+          <w:rFonts w:ascii="Arial" w:hAnsi="Arial" w:eastAsia="Arial" w:cs="Arial" w:asciiTheme="minorAscii" w:hAnsiTheme="minorAscii" w:eastAsiaTheme="minorAscii" w:cstheme="minorAscii"/>
+          <w:b w:val="1"/>
+          <w:bCs w:val="1"/>
+          <w:noProof w:val="0"/>
+          <w:color w:val="auto"/>
+          <w:sz w:val="22"/>
+          <w:szCs w:val="22"/>
+          <w:lang w:val="en-US"/>
+        </w:rPr>
+        <w:t>2. Faculty</w:t>
+      </w:r>
+      <w:r>
+        <w:rPr>
+          <w:rFonts w:ascii="Arial" w:hAnsi="Arial" w:eastAsia="Arial" w:cs="Arial" w:asciiTheme="minorAscii" w:hAnsiTheme="minorAscii" w:eastAsiaTheme="minorAscii" w:cstheme="minorAscii"/>
+          <w:b w:val="1"/>
+          <w:bCs w:val="1"/>
+          <w:noProof w:val="0"/>
+          <w:sz w:val="22"/>
+          <w:szCs w:val="22"/>
+          <w:lang w:val="en-US"/>
+        </w:rPr>
+        <w:t>:</w:t>
+      </w:r>
+      <w:r>
+        <w:br/>
+      </w:r>
+      <w:r>
+        <w:rPr>
+          <w:rFonts w:ascii="Arial" w:hAnsi="Arial" w:eastAsia="Arial" w:cs="Arial" w:asciiTheme="minorAscii" w:hAnsiTheme="minorAscii" w:eastAsiaTheme="minorAscii" w:cstheme="minorAscii"/>
+          <w:noProof w:val="0"/>
+          <w:sz w:val="22"/>
+          <w:szCs w:val="22"/>
+          <w:lang w:val="en-US"/>
+        </w:rPr>
+        <w:t xml:space="preserve"> Faculty members manage attendance for their assigned classes and courses. They can record attendance, view attendance information, and generate relevant attendance reports.</w:t>
+      </w:r>
+    </w:p>
+    <w:p>
+      <w:pPr>
+        <w:spacing w:before="240" w:beforeAutospacing="off" w:after="240" w:afterAutospacing="off"/>
+        <w:rPr>
+          <w:rFonts w:ascii="Arial" w:hAnsi="Arial" w:eastAsia="Arial" w:cs="Arial" w:asciiTheme="minorAscii" w:hAnsiTheme="minorAscii" w:eastAsiaTheme="minorAscii" w:cstheme="minorAscii"/>
+          <w:noProof w:val="0"/>
+          <w:sz w:val="22"/>
+          <w:szCs w:val="22"/>
+          <w:lang w:val="en-US"/>
+        </w:rPr>
+      </w:pPr>
+      <w:r>
+        <w:rPr>
+          <w:rFonts w:ascii="Arial" w:hAnsi="Arial" w:eastAsia="Arial" w:cs="Arial" w:asciiTheme="minorAscii" w:hAnsiTheme="minorAscii" w:eastAsiaTheme="minorAscii" w:cstheme="minorAscii"/>
+          <w:b w:val="1"/>
+          <w:bCs w:val="1"/>
+          <w:noProof w:val="0"/>
+          <w:sz w:val="22"/>
+          <w:szCs w:val="22"/>
+          <w:lang w:val="en-US"/>
+        </w:rPr>
+        <w:t>3. Student:</w:t>
+      </w:r>
+      <w:r>
+        <w:br/>
+      </w:r>
+      <w:r>
+        <w:rPr>
+          <w:rFonts w:ascii="Arial" w:hAnsi="Arial" w:eastAsia="Arial" w:cs="Arial" w:asciiTheme="minorAscii" w:hAnsiTheme="minorAscii" w:eastAsiaTheme="minorAscii" w:cstheme="minorAscii"/>
+          <w:noProof w:val="0"/>
+          <w:sz w:val="22"/>
+          <w:szCs w:val="22"/>
+          <w:lang w:val="en-US"/>
+        </w:rPr>
+        <w:t xml:space="preserve"> Students can access their own attendance records, attendance percentage, and attendance history. Students have read-only access to their attendance information except for functions explicitly permitted by the system.</w:t>
+      </w:r>
+    </w:p>
+    <w:p>
+      <w:pPr>
+        <w:spacing w:before="240" w:beforeAutospacing="off" w:after="240" w:afterAutospacing="off"/>
+        <w:rPr>
+          <w:rFonts w:ascii="Arial" w:hAnsi="Arial" w:eastAsia="Arial" w:cs="Arial" w:asciiTheme="minorAscii" w:hAnsiTheme="minorAscii" w:eastAsiaTheme="minorAscii" w:cstheme="minorAscii"/>
+          <w:noProof w:val="0"/>
+          <w:sz w:val="22"/>
+          <w:szCs w:val="22"/>
+          <w:lang w:val="en-US"/>
+        </w:rPr>
+      </w:pPr>
+      <w:r>
+        <w:rPr>
+          <w:rFonts w:ascii="Arial" w:hAnsi="Arial" w:eastAsia="Arial" w:cs="Arial" w:asciiTheme="minorAscii" w:hAnsiTheme="minorAscii" w:eastAsiaTheme="minorAscii" w:cstheme="minorAscii"/>
+          <w:noProof w:val="0"/>
+          <w:sz w:val="22"/>
+          <w:szCs w:val="22"/>
+          <w:lang w:val="en-US"/>
+        </w:rPr>
+        <w:t>Users will have access only to the functions permitted by their respective roles.</w:t>
+      </w:r>
+    </w:p>
+    <w:p>
       <w:pPr>
         <w:pStyle w:val="normal1"/>
-        <w:keepNext w:val="false"/>
-        <w:keepLines w:val="false"/>
-        <w:pageBreakBefore w:val="false"/>
-        <w:widowControl/>
-        <w:pBdr/>
-        <w:shd w:val="clear" w:fill="auto"/>
+        <w:keepNext w:val="0"/>
+        <w:keepLines w:val="0"/>
+        <w:pageBreakBefore w:val="0"/>
+        <w:widowControl w:val="1"/>
+        <w:shd w:val="clear" w:color="auto" w:fill="auto"/>
         <w:spacing w:before="0" w:after="0" w:line="240" w:lineRule="auto"/>
-        <w:ind w:start="0" w:end="0" w:hanging="0"/>
+        <w:ind w:hanging="0"/>
         <w:jc w:val="both"/>
         <w:rPr>
           <w:rFonts w:ascii="Times New Roman" w:hAnsi="Times New Roman" w:eastAsia="Times New Roman" w:cs="Times New Roman"/>
-          <w:i/>
-          <w:iCs/>
-          <w:caps w:val="false"/>
-          <w:smallCaps w:val="false"/>
-          <w:strike w:val="false"/>
-          <w:dstrike w:val="false"/>
-          <w:color w:val="000000"/>
-          <w:position w:val="0"/>
+          <w:i w:val="1"/>
+          <w:iCs w:val="1"/>
+          <w:caps w:val="0"/>
+          <w:smallCaps w:val="0"/>
+          <w:strike w:val="0"/>
+          <w:dstrike w:val="0"/>
+          <w:color w:val="000000" w:themeColor="text2" w:themeTint="FF" w:themeShade="FF"/>
           <w:sz w:val="22"/>
           <w:szCs w:val="22"/>
           <w:u w:val="none"/>
-          <w:shd w:val="clear" w:fill="auto"/>
           <w:vertAlign w:val="baseline"/>
         </w:rPr>
       </w:pPr>
-      <w:r>
-        <w:rPr>
-          <w:rFonts w:ascii="Times New Roman" w:hAnsi="Times New Roman" w:eastAsia="Times New Roman" w:cs="Times New Roman"/>
-          <w:i/>
-          <w:iCs/>
-          <w:caps w:val="false"/>
-          <w:smallCaps w:val="false"/>
-          <w:strike w:val="false"/>
-          <w:dstrike w:val="false"/>
-          <w:color w:val="000000"/>
-          <w:position w:val="0"/>
+    </w:p>
+    <w:p>
+      <w:pPr>
+        <w:pStyle w:val="Heading2"/>
+        <w:rPr>
+          <w:rFonts w:ascii="Times New Roman" w:hAnsi="Times New Roman" w:eastAsia="Times New Roman" w:cs="Times New Roman"/>
+          <w:b w:val="1"/>
+          <w:bCs w:val="1"/>
+        </w:rPr>
+      </w:pPr>
+    </w:p>
+    <w:p xmlns:wp14="http://schemas.microsoft.com/office/word/2010/wordml" wp14:textId="77777777">
+      <w:pPr>
+        <w:pStyle w:val="Heading2"/>
+        <w:rPr>
+          <w:rFonts w:ascii="Times New Roman" w:hAnsi="Times New Roman" w:eastAsia="Times New Roman" w:cs="Times New Roman"/>
+          <w:b w:val="1"/>
+          <w:bCs w:val="1"/>
+        </w:rPr>
+      </w:pPr>
+      <w:bookmarkStart w:name="_heading=h.557hitykr5uw" w:id="11"/>
+      <w:bookmarkEnd w:id="11"/>
+      <w:r>
+        <w:rPr>
+          <w:rFonts w:ascii="Times New Roman" w:hAnsi="Times New Roman" w:eastAsia="Times New Roman" w:cs="Times New Roman"/>
+          <w:b w:val="1"/>
+          <w:bCs w:val="1"/>
+        </w:rPr>
+        <w:t>Operating Environment</w:t>
+      </w:r>
+    </w:p>
+    <w:p>
+      <w:pPr>
+        <w:pStyle w:val="normal1"/>
+        <w:keepNext w:val="0"/>
+        <w:keepLines w:val="0"/>
+        <w:widowControl w:val="1"/>
+        <w:shd w:val="clear" w:color="auto" w:fill="auto"/>
+        <w:spacing w:before="0" w:after="0" w:line="240" w:lineRule="auto"/>
+        <w:ind w:hanging="0"/>
+        <w:jc w:val="both"/>
+        <w:rPr>
+          <w:rFonts w:ascii="Arial" w:hAnsi="Arial" w:eastAsia="Arial" w:cs="Arial" w:asciiTheme="minorAscii" w:hAnsiTheme="minorAscii" w:eastAsiaTheme="minorAscii" w:cstheme="minorAscii"/>
+          <w:noProof w:val="0"/>
+          <w:sz w:val="22"/>
+          <w:szCs w:val="22"/>
+          <w:lang w:val="en-US"/>
+        </w:rPr>
+      </w:pPr>
+      <w:r>
+        <w:rPr>
+          <w:rFonts w:ascii="Arial" w:hAnsi="Arial" w:eastAsia="Arial" w:cs="Arial" w:asciiTheme="minorAscii" w:hAnsiTheme="minorAscii" w:eastAsiaTheme="minorAscii" w:cstheme="minorAscii"/>
+          <w:noProof w:val="0"/>
+          <w:sz w:val="22"/>
+          <w:szCs w:val="22"/>
+          <w:lang w:val="en-US"/>
+        </w:rPr>
+        <w:t>The Student Attendance Management System will operate as a web-based application accessible through a standard web browser. The system will require a server environment for running the application and a database server for storing system data. Users will access the system through computers or other supported devices connected to the network. The specific programming framework, database, operating system, and deployment environment will be finalized during the design and implementation phase.</w:t>
+      </w:r>
+    </w:p>
+    <w:p>
+      <w:pPr>
+        <w:pStyle w:val="Heading2"/>
+      </w:pPr>
+      <w:bookmarkStart w:name="_heading=h.fuqnpkmp2x0e" w:id="12"/>
+      <w:bookmarkEnd w:id="12"/>
+      <w:r>
+        <w:rPr>
+          <w:rFonts w:ascii="Times New Roman" w:hAnsi="Times New Roman" w:eastAsia="Times New Roman" w:cs="Times New Roman"/>
+        </w:rPr>
+        <w:t>Design and Implementation Constraints</w:t>
+      </w:r>
+    </w:p>
+    <w:p>
+      <w:pPr>
+        <w:pStyle w:val="Heading2"/>
+        <w:rPr>
+          <w:noProof w:val="0"/>
+          <w:color w:val="auto"/>
+          <w:lang w:val="en-US"/>
+        </w:rPr>
+      </w:pPr>
+      <w:r>
+        <w:rPr>
+          <w:noProof w:val="0"/>
+          <w:color w:val="auto"/>
+          <w:lang w:val="en-US"/>
+        </w:rPr>
+        <w:t>The following constraints apply to the development and implementation of the system:</w:t>
+      </w:r>
+    </w:p>
+    <w:p>
+      <w:pPr>
+        <w:pStyle w:val="ListParagraph"/>
+        <w:numPr>
+          <w:ilvl w:val="0"/>
+          <w:numId w:val="3"/>
+        </w:numPr>
+        <w:spacing w:before="0" w:beforeAutospacing="off" w:after="0" w:afterAutospacing="off"/>
+        <w:rPr>
+          <w:noProof w:val="0"/>
+          <w:color w:val="auto"/>
+          <w:lang w:val="en-US"/>
+        </w:rPr>
+      </w:pPr>
+      <w:r>
+        <w:rPr>
+          <w:noProof w:val="0"/>
+          <w:color w:val="auto"/>
+          <w:lang w:val="en-US"/>
+        </w:rPr>
+        <w:t xml:space="preserve">The system shall be developed using one of the programming technologies specified for the project: Python with Django/Flask or Java with Spring Boot. </w:t>
+      </w:r>
+    </w:p>
+    <w:p>
+      <w:pPr>
+        <w:pStyle w:val="ListParagraph"/>
+        <w:numPr>
+          <w:ilvl w:val="0"/>
+          <w:numId w:val="3"/>
+        </w:numPr>
+        <w:spacing w:before="0" w:beforeAutospacing="off" w:after="0" w:afterAutospacing="off"/>
+        <w:rPr>
+          <w:noProof w:val="0"/>
+          <w:color w:val="auto"/>
+          <w:lang w:val="en-US"/>
+        </w:rPr>
+      </w:pPr>
+      <w:r>
+        <w:rPr>
+          <w:noProof w:val="0"/>
+          <w:color w:val="auto"/>
+          <w:lang w:val="en-US"/>
+        </w:rPr>
+        <w:t xml:space="preserve">The system shall use a database for persistent storage of student, faculty, course, and attendance information. </w:t>
+      </w:r>
+    </w:p>
+    <w:p>
+      <w:pPr>
+        <w:pStyle w:val="ListParagraph"/>
+        <w:numPr>
+          <w:ilvl w:val="0"/>
+          <w:numId w:val="3"/>
+        </w:numPr>
+        <w:spacing w:before="0" w:beforeAutospacing="off" w:after="0" w:afterAutospacing="off"/>
+        <w:rPr>
+          <w:noProof w:val="0"/>
+          <w:color w:val="auto"/>
+          <w:lang w:val="en-US"/>
+        </w:rPr>
+      </w:pPr>
+      <w:r>
+        <w:rPr>
+          <w:noProof w:val="0"/>
+          <w:color w:val="auto"/>
+          <w:lang w:val="en-US"/>
+        </w:rPr>
+        <w:t xml:space="preserve">Access to system functions shall be controlled according to user roles. </w:t>
+      </w:r>
+    </w:p>
+    <w:p>
+      <w:pPr>
+        <w:pStyle w:val="ListParagraph"/>
+        <w:numPr>
+          <w:ilvl w:val="0"/>
+          <w:numId w:val="3"/>
+        </w:numPr>
+        <w:spacing w:before="0" w:beforeAutospacing="off" w:after="0" w:afterAutospacing="off"/>
+        <w:rPr>
+          <w:noProof w:val="0"/>
+          <w:color w:val="auto"/>
+          <w:lang w:val="en-US"/>
+        </w:rPr>
+      </w:pPr>
+      <w:r>
+        <w:rPr>
+          <w:noProof w:val="0"/>
+          <w:color w:val="auto"/>
+          <w:lang w:val="en-US"/>
+        </w:rPr>
+        <w:t>The system shall follow appropriate software development and coding practices.</w:t>
+      </w:r>
+      <w:r>
+        <w:rPr>
+          <w:noProof w:val="0"/>
+          <w:color w:val="auto"/>
+          <w:lang w:val="en-US"/>
+        </w:rPr>
+        <w:t xml:space="preserve"> </w:t>
+      </w:r>
+      <w:r>
+        <w:rPr>
+          <w:noProof w:val="0"/>
+          <w:color w:val="auto"/>
+          <w:lang w:val="en-US"/>
+        </w:rPr>
+        <w:t xml:space="preserve">The system shall use standard web communication protocols for communication between the client and server. </w:t>
+      </w:r>
+    </w:p>
+    <w:p>
+      <w:pPr>
+        <w:pStyle w:val="ListParagraph"/>
+        <w:numPr>
+          <w:ilvl w:val="0"/>
+          <w:numId w:val="3"/>
+        </w:numPr>
+        <w:spacing w:before="0" w:beforeAutospacing="off" w:after="0" w:afterAutospacing="off"/>
+        <w:rPr>
+          <w:noProof w:val="0"/>
+          <w:color w:val="auto"/>
+          <w:lang w:val="en-US"/>
+        </w:rPr>
+      </w:pPr>
+      <w:r>
+        <w:rPr>
+          <w:noProof w:val="0"/>
+          <w:color w:val="auto"/>
+          <w:lang w:val="en-US"/>
+        </w:rPr>
+        <w:t>Attendance data shall be protected from unauthorized access or modification.</w:t>
+      </w:r>
+    </w:p>
+    <w:p>
+      <w:pPr>
+        <w:pStyle w:val="normal1"/>
+        <w:keepNext w:val="0"/>
+        <w:keepLines w:val="0"/>
+        <w:pageBreakBefore w:val="0"/>
+        <w:widowControl w:val="1"/>
+        <w:shd w:val="clear" w:color="auto" w:fill="auto"/>
+        <w:spacing w:before="0" w:after="0" w:line="240" w:lineRule="auto"/>
+        <w:ind w:hanging="0"/>
+        <w:jc w:val="both"/>
+        <w:rPr>
+          <w:rFonts w:ascii="Times New Roman" w:hAnsi="Times New Roman" w:eastAsia="Times New Roman" w:cs="Times New Roman"/>
+          <w:i w:val="1"/>
+          <w:iCs w:val="1"/>
+          <w:caps w:val="0"/>
+          <w:smallCaps w:val="0"/>
+          <w:strike w:val="0"/>
+          <w:dstrike w:val="0"/>
+          <w:color w:val="000000" w:themeColor="text2" w:themeTint="FF" w:themeShade="FF"/>
           <w:sz w:val="22"/>
           <w:szCs w:val="22"/>
           <w:u w:val="none"/>
-          <w:shd w:val="clear" w:fill="auto"/>
           <w:vertAlign w:val="baseline"/>
         </w:rPr>
-        <w:t>&lt;Summarize the major functions the product must perform or must let the user perform. Details will be provided in Section 3, so only a high level summary (such as a bullet list) is needed here. Organize the functions to make them understandable to any reader of the SRS. A picture of the major groups of related requirements and how they relate, such as a top level data flow diagram or object class diagram, is often effective.&gt;</w:t>
-      </w:r>
-    </w:p>
-    <w:p xmlns:wp14="http://schemas.microsoft.com/office/word/2010/wordml" wp14:textId="77777777">
+      </w:pPr>
+    </w:p>
+    <w:p>
       <w:pPr>
         <w:pStyle w:val="Heading2"/>
-        <w:rPr/>
-      </w:pPr>
-      <w:bookmarkStart w:name="_heading=h.u6kjbwmryldc" w:id="10"/>
-      <w:bookmarkEnd w:id="10"/>
-      <w:r>
-        <w:rPr>
-          <w:rFonts w:ascii="Times New Roman" w:hAnsi="Times New Roman" w:eastAsia="Times New Roman" w:cs="Times New Roman"/>
-        </w:rPr>
-        <w:t>User Classes and Characteristics</w:t>
-      </w:r>
-    </w:p>
-    <w:p xmlns:wp14="http://schemas.microsoft.com/office/word/2010/wordml" wp14:textId="77777777">
+      </w:pPr>
+      <w:bookmarkStart w:name="_heading=h.m42l38987arh" w:id="13"/>
+      <w:bookmarkEnd w:id="13"/>
+      <w:r>
+        <w:rPr>
+          <w:rFonts w:ascii="Times New Roman" w:hAnsi="Times New Roman" w:eastAsia="Times New Roman" w:cs="Times New Roman"/>
+        </w:rPr>
+        <w:t>2.6 Assumptions and Dependencies</w:t>
+      </w:r>
+    </w:p>
+    <w:p>
+      <w:pPr>
+        <w:pStyle w:val="Heading2"/>
+        <w:rPr>
+          <w:noProof w:val="0"/>
+          <w:color w:val="auto"/>
+          <w:sz w:val="22"/>
+          <w:szCs w:val="22"/>
+          <w:lang w:val="en-US"/>
+        </w:rPr>
+      </w:pPr>
+      <w:r>
+        <w:rPr>
+          <w:noProof w:val="0"/>
+          <w:color w:val="auto"/>
+          <w:sz w:val="22"/>
+          <w:szCs w:val="22"/>
+          <w:lang w:val="en-US"/>
+        </w:rPr>
+        <w:t>The following assumptions and dependencies are considered for the system:</w:t>
+      </w:r>
+    </w:p>
+    <w:p>
+      <w:pPr>
+        <w:pStyle w:val="ListParagraph"/>
+        <w:numPr>
+          <w:ilvl w:val="0"/>
+          <w:numId w:val="4"/>
+        </w:numPr>
+        <w:spacing w:before="0" w:beforeAutospacing="off" w:after="0" w:afterAutospacing="off"/>
+        <w:rPr>
+          <w:noProof w:val="0"/>
+          <w:color w:val="auto"/>
+          <w:sz w:val="22"/>
+          <w:szCs w:val="22"/>
+          <w:lang w:val="en-US"/>
+        </w:rPr>
+      </w:pPr>
+      <w:r>
+        <w:rPr>
+          <w:noProof w:val="0"/>
+          <w:color w:val="auto"/>
+          <w:sz w:val="22"/>
+          <w:szCs w:val="22"/>
+          <w:lang w:val="en-US"/>
+        </w:rPr>
+        <w:t xml:space="preserve">Users are assumed to have valid credentials to access the system. </w:t>
+      </w:r>
+    </w:p>
+    <w:p>
+      <w:pPr>
+        <w:pStyle w:val="ListParagraph"/>
+        <w:numPr>
+          <w:ilvl w:val="0"/>
+          <w:numId w:val="4"/>
+        </w:numPr>
+        <w:spacing w:before="0" w:beforeAutospacing="off" w:after="0" w:afterAutospacing="off"/>
+        <w:rPr>
+          <w:noProof w:val="0"/>
+          <w:color w:val="auto"/>
+          <w:sz w:val="22"/>
+          <w:szCs w:val="22"/>
+          <w:lang w:val="en-US"/>
+        </w:rPr>
+      </w:pPr>
+      <w:r>
+        <w:rPr>
+          <w:noProof w:val="0"/>
+          <w:color w:val="auto"/>
+          <w:sz w:val="22"/>
+          <w:szCs w:val="22"/>
+          <w:lang w:val="en-US"/>
+        </w:rPr>
+        <w:t xml:space="preserve">Faculty members are assumed to be authorized to manage attendance for their assigned classes. </w:t>
+      </w:r>
+    </w:p>
+    <w:p>
+      <w:pPr>
+        <w:pStyle w:val="ListParagraph"/>
+        <w:numPr>
+          <w:ilvl w:val="0"/>
+          <w:numId w:val="4"/>
+        </w:numPr>
+        <w:spacing w:before="0" w:beforeAutospacing="off" w:after="0" w:afterAutospacing="off"/>
+        <w:rPr>
+          <w:noProof w:val="0"/>
+          <w:color w:val="auto"/>
+          <w:sz w:val="22"/>
+          <w:szCs w:val="22"/>
+          <w:lang w:val="en-US"/>
+        </w:rPr>
+      </w:pPr>
+      <w:r>
+        <w:rPr>
+          <w:noProof w:val="0"/>
+          <w:color w:val="auto"/>
+          <w:sz w:val="22"/>
+          <w:szCs w:val="22"/>
+          <w:lang w:val="en-US"/>
+        </w:rPr>
+        <w:t xml:space="preserve">Student and course information required by the system is assumed to be available and accurate. </w:t>
+      </w:r>
+    </w:p>
+    <w:p>
+      <w:pPr>
+        <w:pStyle w:val="ListParagraph"/>
+        <w:numPr>
+          <w:ilvl w:val="0"/>
+          <w:numId w:val="4"/>
+        </w:numPr>
+        <w:spacing w:before="0" w:beforeAutospacing="off" w:after="0" w:afterAutospacing="off"/>
+        <w:rPr>
+          <w:noProof w:val="0"/>
+          <w:color w:val="auto"/>
+          <w:sz w:val="22"/>
+          <w:szCs w:val="22"/>
+          <w:lang w:val="en-US"/>
+        </w:rPr>
+      </w:pPr>
+      <w:r>
+        <w:rPr>
+          <w:noProof w:val="0"/>
+          <w:color w:val="auto"/>
+          <w:sz w:val="22"/>
+          <w:szCs w:val="22"/>
+          <w:lang w:val="en-US"/>
+        </w:rPr>
+        <w:t xml:space="preserve">Users are assumed to have access to a supported web browser and network connection. </w:t>
+      </w:r>
+    </w:p>
+    <w:p>
+      <w:pPr>
+        <w:pStyle w:val="ListParagraph"/>
+        <w:numPr>
+          <w:ilvl w:val="0"/>
+          <w:numId w:val="4"/>
+        </w:numPr>
+        <w:spacing w:before="0" w:beforeAutospacing="off" w:after="0" w:afterAutospacing="off"/>
+        <w:rPr>
+          <w:noProof w:val="0"/>
+          <w:color w:val="auto"/>
+          <w:sz w:val="22"/>
+          <w:szCs w:val="22"/>
+          <w:lang w:val="en-US"/>
+        </w:rPr>
+      </w:pPr>
+      <w:r>
+        <w:rPr>
+          <w:noProof w:val="0"/>
+          <w:color w:val="auto"/>
+          <w:sz w:val="22"/>
+          <w:szCs w:val="22"/>
+          <w:lang w:val="en-US"/>
+        </w:rPr>
+        <w:t xml:space="preserve">The system depends on the availability of the application server and database server. </w:t>
+      </w:r>
+    </w:p>
+    <w:p>
+      <w:pPr>
+        <w:pStyle w:val="ListParagraph"/>
+        <w:numPr>
+          <w:ilvl w:val="0"/>
+          <w:numId w:val="4"/>
+        </w:numPr>
+        <w:spacing w:before="0" w:beforeAutospacing="off" w:after="0" w:afterAutospacing="off"/>
+        <w:rPr>
+          <w:noProof w:val="0"/>
+          <w:color w:val="auto"/>
+          <w:sz w:val="22"/>
+          <w:szCs w:val="22"/>
+          <w:lang w:val="en-US"/>
+        </w:rPr>
+      </w:pPr>
+      <w:r>
+        <w:rPr>
+          <w:noProof w:val="0"/>
+          <w:color w:val="auto"/>
+          <w:sz w:val="22"/>
+          <w:szCs w:val="22"/>
+          <w:lang w:val="en-US"/>
+        </w:rPr>
+        <w:t xml:space="preserve">The system depends on the selected software framework and database technology for its implementation. </w:t>
+      </w:r>
+    </w:p>
+    <w:p>
+      <w:pPr>
+        <w:pStyle w:val="ListParagraph"/>
+        <w:numPr>
+          <w:ilvl w:val="0"/>
+          <w:numId w:val="4"/>
+        </w:numPr>
+        <w:spacing w:before="0" w:beforeAutospacing="off" w:after="0" w:afterAutospacing="off"/>
+        <w:rPr>
+          <w:noProof w:val="0"/>
+          <w:color w:val="auto"/>
+          <w:sz w:val="22"/>
+          <w:szCs w:val="22"/>
+          <w:lang w:val="en-US"/>
+        </w:rPr>
+      </w:pPr>
+      <w:r>
+        <w:rPr>
+          <w:noProof w:val="0"/>
+          <w:color w:val="auto"/>
+          <w:sz w:val="22"/>
+          <w:szCs w:val="22"/>
+          <w:lang w:val="en-US"/>
+        </w:rPr>
+        <w:t>The accuracy of attendance reports depends on the correctness of the attendance data entered into the system.</w:t>
+      </w:r>
+    </w:p>
+    <w:p>
       <w:pPr>
         <w:pStyle w:val="normal1"/>
-        <w:keepNext w:val="false"/>
-        <w:keepLines w:val="false"/>
-        <w:pageBreakBefore w:val="false"/>
-        <w:widowControl/>
-        <w:pBdr/>
-        <w:shd w:val="clear" w:fill="auto"/>
+        <w:keepNext w:val="0"/>
+        <w:keepLines w:val="0"/>
+        <w:pageBreakBefore w:val="0"/>
+        <w:widowControl w:val="1"/>
+        <w:shd w:val="clear" w:color="auto" w:fill="auto"/>
         <w:spacing w:before="0" w:after="0" w:line="240" w:lineRule="auto"/>
-        <w:ind w:start="0" w:end="0" w:hanging="0"/>
+        <w:ind w:hanging="0"/>
         <w:jc w:val="both"/>
         <w:rPr>
           <w:rFonts w:ascii="Times New Roman" w:hAnsi="Times New Roman" w:eastAsia="Times New Roman" w:cs="Times New Roman"/>
-          <w:i/>
-          <w:iCs/>
-          <w:caps w:val="false"/>
-          <w:smallCaps w:val="false"/>
-          <w:strike w:val="false"/>
-          <w:dstrike w:val="false"/>
-          <w:color w:val="000000"/>
-          <w:position w:val="0"/>
+          <w:i w:val="1"/>
+          <w:iCs w:val="1"/>
+          <w:caps w:val="0"/>
+          <w:smallCaps w:val="0"/>
+          <w:strike w:val="0"/>
+          <w:dstrike w:val="0"/>
+          <w:color w:val="000000" w:themeColor="text2" w:themeTint="FF" w:themeShade="FF"/>
           <w:sz w:val="22"/>
           <w:szCs w:val="22"/>
           <w:u w:val="none"/>
-          <w:shd w:val="clear" w:fill="auto"/>
           <w:vertAlign w:val="baseline"/>
         </w:rPr>
       </w:pPr>
-      <w:r>
-        <w:rPr>
-          <w:rFonts w:ascii="Times New Roman" w:hAnsi="Times New Roman" w:eastAsia="Times New Roman" w:cs="Times New Roman"/>
-          <w:i/>
-          <w:iCs/>
-          <w:caps w:val="false"/>
-          <w:smallCaps w:val="false"/>
-          <w:strike w:val="false"/>
-          <w:dstrike w:val="false"/>
-          <w:color w:val="000000"/>
-          <w:position w:val="0"/>
+    </w:p>
+    <w:p>
+      <w:pPr>
+        <w:pStyle w:val="normal1"/>
+        <w:keepNext w:val="0"/>
+        <w:keepLines w:val="0"/>
+        <w:pageBreakBefore w:val="0"/>
+        <w:widowControl w:val="1"/>
+        <w:shd w:val="clear" w:color="auto" w:fill="auto"/>
+        <w:spacing w:before="0" w:after="0" w:line="240" w:lineRule="auto"/>
+        <w:ind w:hanging="0"/>
+        <w:jc w:val="both"/>
+        <w:rPr>
+          <w:rFonts w:ascii="Times New Roman" w:hAnsi="Times New Roman" w:eastAsia="Times New Roman" w:cs="Times New Roman"/>
+          <w:i w:val="1"/>
+          <w:iCs w:val="1"/>
+          <w:caps w:val="0"/>
+          <w:smallCaps w:val="0"/>
+          <w:strike w:val="0"/>
+          <w:dstrike w:val="0"/>
+          <w:color w:val="000000" w:themeColor="text2" w:themeTint="FF" w:themeShade="FF"/>
           <w:sz w:val="22"/>
           <w:szCs w:val="22"/>
           <w:u w:val="none"/>
-          <w:shd w:val="clear" w:fill="auto"/>
           <w:vertAlign w:val="baseline"/>
         </w:rPr>
-        <w:t>&lt;Identify the various user classes that you anticipate will use this product. User classes may be differentiated based on frequency of use, subset of product functions used, technical expertise, security or privilege levels, educational level, or experience. Describe the pertinent characteristics of each user class. Certain requirements may pertain only to certain user classes. Distinguish the most important user classes for this product from those who are less important to satisfy.&gt;</w:t>
-      </w:r>
-    </w:p>
-    <w:p xmlns:wp14="http://schemas.microsoft.com/office/word/2010/wordml" wp14:textId="77777777">
-      <w:pPr>
-        <w:pStyle w:val="Heading2"/>
-        <w:rPr/>
-      </w:pPr>
-      <w:bookmarkStart w:name="_heading=h.557hitykr5uw" w:id="11"/>
-      <w:bookmarkEnd w:id="11"/>
-      <w:r>
-        <w:rPr>
-          <w:rFonts w:ascii="Times New Roman" w:hAnsi="Times New Roman" w:eastAsia="Times New Roman" w:cs="Times New Roman"/>
-        </w:rPr>
-        <w:t>Operating Environment</w:t>
-      </w:r>
-    </w:p>
-    <w:p xmlns:wp14="http://schemas.microsoft.com/office/word/2010/wordml" wp14:textId="77777777">
+      </w:pPr>
+    </w:p>
+    <w:p>
       <w:pPr>
         <w:pStyle w:val="normal1"/>
-        <w:keepNext w:val="false"/>
-        <w:keepLines w:val="false"/>
-        <w:pageBreakBefore w:val="false"/>
-        <w:widowControl/>
-        <w:pBdr/>
-        <w:shd w:val="clear" w:fill="auto"/>
+        <w:keepNext w:val="0"/>
+        <w:keepLines w:val="0"/>
+        <w:pageBreakBefore w:val="0"/>
+        <w:widowControl w:val="1"/>
+        <w:shd w:val="clear" w:color="auto" w:fill="auto"/>
         <w:spacing w:before="0" w:after="0" w:line="240" w:lineRule="auto"/>
-        <w:ind w:start="0" w:end="0" w:hanging="0"/>
+        <w:ind w:hanging="0"/>
         <w:jc w:val="both"/>
         <w:rPr>
           <w:rFonts w:ascii="Times New Roman" w:hAnsi="Times New Roman" w:eastAsia="Times New Roman" w:cs="Times New Roman"/>
-          <w:i/>
-          <w:iCs/>
-          <w:caps w:val="false"/>
-          <w:smallCaps w:val="false"/>
-          <w:strike w:val="false"/>
-          <w:dstrike w:val="false"/>
-          <w:color w:val="000000"/>
-          <w:position w:val="0"/>
+          <w:i w:val="1"/>
+          <w:iCs w:val="1"/>
+          <w:caps w:val="0"/>
+          <w:smallCaps w:val="0"/>
+          <w:strike w:val="0"/>
+          <w:dstrike w:val="0"/>
+          <w:color w:val="000000" w:themeColor="text2" w:themeTint="FF" w:themeShade="FF"/>
           <w:sz w:val="22"/>
           <w:szCs w:val="22"/>
           <w:u w:val="none"/>
-          <w:shd w:val="clear" w:fill="auto"/>
           <w:vertAlign w:val="baseline"/>
         </w:rPr>
       </w:pPr>
-      <w:r>
-        <w:rPr>
-          <w:rFonts w:ascii="Times New Roman" w:hAnsi="Times New Roman" w:eastAsia="Times New Roman" w:cs="Times New Roman"/>
-          <w:i/>
-          <w:iCs/>
-          <w:caps w:val="false"/>
-          <w:smallCaps w:val="false"/>
-          <w:strike w:val="false"/>
-          <w:dstrike w:val="false"/>
-          <w:color w:val="000000"/>
-          <w:position w:val="0"/>
+    </w:p>
+    <w:p>
+      <w:pPr>
+        <w:pStyle w:val="normal1"/>
+        <w:keepNext w:val="0"/>
+        <w:keepLines w:val="0"/>
+        <w:pageBreakBefore w:val="0"/>
+        <w:widowControl w:val="1"/>
+        <w:shd w:val="clear" w:color="auto" w:fill="auto"/>
+        <w:spacing w:before="0" w:after="0" w:line="240" w:lineRule="auto"/>
+        <w:ind w:hanging="0"/>
+        <w:jc w:val="both"/>
+        <w:rPr>
+          <w:rFonts w:ascii="Times New Roman" w:hAnsi="Times New Roman" w:eastAsia="Times New Roman" w:cs="Times New Roman"/>
+          <w:i w:val="1"/>
+          <w:iCs w:val="1"/>
+          <w:caps w:val="0"/>
+          <w:smallCaps w:val="0"/>
+          <w:strike w:val="0"/>
+          <w:dstrike w:val="0"/>
+          <w:color w:val="000000" w:themeColor="text2" w:themeTint="FF" w:themeShade="FF"/>
           <w:sz w:val="22"/>
           <w:szCs w:val="22"/>
           <w:u w:val="none"/>
-          <w:shd w:val="clear" w:fill="auto"/>
           <w:vertAlign w:val="baseline"/>
         </w:rPr>
-        <w:t>&lt;Describe the environment in which the software will operate, including the hardware platform, operating system and versions, and any other software components or applications with which it must peacefully coexist.&gt;</w:t>
-      </w:r>
-    </w:p>
-    <w:p xmlns:wp14="http://schemas.microsoft.com/office/word/2010/wordml" wp14:textId="77777777">
-      <w:pPr>
-        <w:pStyle w:val="Heading2"/>
-        <w:rPr/>
-      </w:pPr>
-      <w:bookmarkStart w:name="_heading=h.fuqnpkmp2x0e" w:id="12"/>
-      <w:bookmarkEnd w:id="12"/>
-      <w:r>
-        <w:rPr>
-          <w:rFonts w:ascii="Times New Roman" w:hAnsi="Times New Roman" w:eastAsia="Times New Roman" w:cs="Times New Roman"/>
-        </w:rPr>
-        <w:t>Design and Implementation Constraints</w:t>
-      </w:r>
-    </w:p>
-    <w:p xmlns:wp14="http://schemas.microsoft.com/office/word/2010/wordml" wp14:textId="77777777">
+      </w:pPr>
+    </w:p>
+    <w:p>
       <w:pPr>
         <w:pStyle w:val="normal1"/>
-        <w:keepNext w:val="false"/>
-        <w:keepLines w:val="false"/>
-        <w:pageBreakBefore w:val="false"/>
-        <w:widowControl/>
-        <w:pBdr/>
-        <w:shd w:val="clear" w:fill="auto"/>
+        <w:keepNext w:val="0"/>
+        <w:keepLines w:val="0"/>
+        <w:pageBreakBefore w:val="0"/>
+        <w:widowControl w:val="1"/>
+        <w:shd w:val="clear" w:color="auto" w:fill="auto"/>
         <w:spacing w:before="0" w:after="0" w:line="240" w:lineRule="auto"/>
-        <w:ind w:start="0" w:end="0" w:hanging="0"/>
+        <w:ind w:hanging="0"/>
         <w:jc w:val="both"/>
         <w:rPr>
           <w:rFonts w:ascii="Times New Roman" w:hAnsi="Times New Roman" w:eastAsia="Times New Roman" w:cs="Times New Roman"/>
-          <w:i/>
-          <w:iCs/>
-          <w:caps w:val="false"/>
-          <w:smallCaps w:val="false"/>
-          <w:strike w:val="false"/>
-          <w:dstrike w:val="false"/>
-          <w:color w:val="000000"/>
-          <w:position w:val="0"/>
+          <w:i w:val="1"/>
+          <w:iCs w:val="1"/>
+          <w:caps w:val="0"/>
+          <w:smallCaps w:val="0"/>
+          <w:strike w:val="0"/>
+          <w:dstrike w:val="0"/>
+          <w:color w:val="000000" w:themeColor="text2" w:themeTint="FF" w:themeShade="FF"/>
           <w:sz w:val="22"/>
           <w:szCs w:val="22"/>
           <w:u w:val="none"/>
-          <w:shd w:val="clear" w:fill="auto"/>
           <w:vertAlign w:val="baseline"/>
         </w:rPr>
       </w:pPr>
-      <w:r>
-        <w:rPr>
-          <w:rFonts w:ascii="Times New Roman" w:hAnsi="Times New Roman" w:eastAsia="Times New Roman" w:cs="Times New Roman"/>
-          <w:i/>
-          <w:iCs/>
-          <w:caps w:val="false"/>
-          <w:smallCaps w:val="false"/>
-          <w:strike w:val="false"/>
-          <w:dstrike w:val="false"/>
-          <w:color w:val="000000"/>
-          <w:position w:val="0"/>
+    </w:p>
+    <w:p>
+      <w:pPr>
+        <w:pStyle w:val="normal1"/>
+        <w:keepNext w:val="0"/>
+        <w:keepLines w:val="0"/>
+        <w:pageBreakBefore w:val="0"/>
+        <w:widowControl w:val="1"/>
+        <w:shd w:val="clear" w:color="auto" w:fill="auto"/>
+        <w:spacing w:before="0" w:after="0" w:line="240" w:lineRule="auto"/>
+        <w:ind w:hanging="0"/>
+        <w:jc w:val="both"/>
+        <w:rPr>
+          <w:rFonts w:ascii="Times New Roman" w:hAnsi="Times New Roman" w:eastAsia="Times New Roman" w:cs="Times New Roman"/>
+          <w:i w:val="1"/>
+          <w:iCs w:val="1"/>
+          <w:caps w:val="0"/>
+          <w:smallCaps w:val="0"/>
+          <w:strike w:val="0"/>
+          <w:dstrike w:val="0"/>
+          <w:color w:val="000000" w:themeColor="text2" w:themeTint="FF" w:themeShade="FF"/>
           <w:sz w:val="22"/>
           <w:szCs w:val="22"/>
           <w:u w:val="none"/>
-          <w:shd w:val="clear" w:fill="auto"/>
           <w:vertAlign w:val="baseline"/>
         </w:rPr>
-        <w:t>&lt;Describe any items or issues that will limit the options available to the developers. These might include: corporate or regulatory policies; hardware limitations (timing requirements, memory requirements); interfaces to other applications; specific technologies, tools, and databases to be used; parallel operations; language requirements; communications protocols; security considerations; design conventions or programming standards (for example, if the customer’s organization will be responsible for maintaining the delivered software).&gt;</w:t>
-      </w:r>
-    </w:p>
-    <w:p xmlns:wp14="http://schemas.microsoft.com/office/word/2010/wordml" wp14:textId="77777777">
-      <w:pPr>
-        <w:pStyle w:val="Heading2"/>
-        <w:rPr/>
-      </w:pPr>
-      <w:bookmarkStart w:name="_heading=h.m42l38987arh" w:id="13"/>
-      <w:bookmarkEnd w:id="13"/>
-      <w:r>
-        <w:rPr>
-          <w:rFonts w:ascii="Times New Roman" w:hAnsi="Times New Roman" w:eastAsia="Times New Roman" w:cs="Times New Roman"/>
-        </w:rPr>
-        <w:t>2.6 Assumptions and Dependencies</w:t>
-      </w:r>
-    </w:p>
-    <w:p xmlns:wp14="http://schemas.microsoft.com/office/word/2010/wordml" wp14:textId="77777777">
+      </w:pPr>
+    </w:p>
+    <w:p>
       <w:pPr>
         <w:pStyle w:val="normal1"/>
-        <w:keepNext w:val="false"/>
-        <w:keepLines w:val="false"/>
-        <w:pageBreakBefore w:val="false"/>
-        <w:widowControl/>
-        <w:pBdr/>
-        <w:shd w:val="clear" w:fill="auto"/>
+        <w:keepNext w:val="0"/>
+        <w:keepLines w:val="0"/>
+        <w:pageBreakBefore w:val="0"/>
+        <w:widowControl w:val="1"/>
+        <w:shd w:val="clear" w:color="auto" w:fill="auto"/>
         <w:spacing w:before="0" w:after="0" w:line="240" w:lineRule="auto"/>
-        <w:ind w:start="0" w:end="0" w:hanging="0"/>
+        <w:ind w:hanging="0"/>
         <w:jc w:val="both"/>
         <w:rPr>
           <w:rFonts w:ascii="Times New Roman" w:hAnsi="Times New Roman" w:eastAsia="Times New Roman" w:cs="Times New Roman"/>
-          <w:i/>
-          <w:iCs/>
-          <w:caps w:val="false"/>
-          <w:smallCaps w:val="false"/>
-          <w:strike w:val="false"/>
-          <w:dstrike w:val="false"/>
-          <w:color w:val="000000"/>
-          <w:position w:val="0"/>
+          <w:i w:val="1"/>
+          <w:iCs w:val="1"/>
+          <w:caps w:val="0"/>
+          <w:smallCaps w:val="0"/>
+          <w:strike w:val="0"/>
+          <w:dstrike w:val="0"/>
+          <w:color w:val="000000" w:themeColor="text2" w:themeTint="FF" w:themeShade="FF"/>
           <w:sz w:val="22"/>
           <w:szCs w:val="22"/>
           <w:u w:val="none"/>
-          <w:shd w:val="clear" w:fill="auto"/>
           <w:vertAlign w:val="baseline"/>
         </w:rPr>
       </w:pPr>
-      <w:r>
-        <w:rPr>
-          <w:rFonts w:ascii="Times New Roman" w:hAnsi="Times New Roman" w:eastAsia="Times New Roman" w:cs="Times New Roman"/>
-          <w:i/>
-          <w:iCs/>
-          <w:caps w:val="false"/>
-          <w:smallCaps w:val="false"/>
-          <w:strike w:val="false"/>
-          <w:dstrike w:val="false"/>
-          <w:color w:val="000000"/>
-          <w:position w:val="0"/>
+    </w:p>
+    <w:p>
+      <w:pPr>
+        <w:pStyle w:val="normal1"/>
+        <w:keepNext w:val="0"/>
+        <w:keepLines w:val="0"/>
+        <w:pageBreakBefore w:val="0"/>
+        <w:widowControl w:val="1"/>
+        <w:shd w:val="clear" w:color="auto" w:fill="auto"/>
+        <w:spacing w:before="0" w:after="0" w:line="240" w:lineRule="auto"/>
+        <w:ind w:hanging="0"/>
+        <w:jc w:val="both"/>
+        <w:rPr>
+          <w:rFonts w:ascii="Times New Roman" w:hAnsi="Times New Roman" w:eastAsia="Times New Roman" w:cs="Times New Roman"/>
+          <w:i w:val="1"/>
+          <w:iCs w:val="1"/>
+          <w:caps w:val="0"/>
+          <w:smallCaps w:val="0"/>
+          <w:strike w:val="0"/>
+          <w:dstrike w:val="0"/>
+          <w:color w:val="000000" w:themeColor="text2" w:themeTint="FF" w:themeShade="FF"/>
           <w:sz w:val="22"/>
           <w:szCs w:val="22"/>
           <w:u w:val="none"/>
-          <w:shd w:val="clear" w:fill="auto"/>
           <w:vertAlign w:val="baseline"/>
         </w:rPr>
-        <w:t>&lt;List any assumed factors (as opposed to known facts) that could affect the requirements stated in the SRS. These could include third-party or commercial components that you plan to use, issues around the development or operating environment, or constraints. The project could be affected if these assumptions are incorrect, are not shared, or change. Also identify any dependencies the project has on external factors, such as software components that you intend to reuse from another project, unless they are already documented elsewhere (for example, in the vision and scope document or the project plan).&gt;</w:t>
-      </w:r>
-    </w:p>
-    <w:p xmlns:wp14="http://schemas.microsoft.com/office/word/2010/wordml" wp14:textId="77777777">
+      </w:pPr>
+    </w:p>
+    <w:p>
+      <w:pPr>
+        <w:pStyle w:val="normal1"/>
+        <w:keepNext w:val="0"/>
+        <w:keepLines w:val="0"/>
+        <w:pageBreakBefore w:val="0"/>
+        <w:widowControl w:val="1"/>
+        <w:shd w:val="clear" w:color="auto" w:fill="auto"/>
+        <w:spacing w:before="0" w:after="0" w:line="240" w:lineRule="auto"/>
+        <w:ind w:hanging="0"/>
+        <w:jc w:val="both"/>
+        <w:rPr>
+          <w:rFonts w:ascii="Times New Roman" w:hAnsi="Times New Roman" w:eastAsia="Times New Roman" w:cs="Times New Roman"/>
+          <w:i w:val="1"/>
+          <w:iCs w:val="1"/>
+          <w:caps w:val="0"/>
+          <w:smallCaps w:val="0"/>
+          <w:strike w:val="0"/>
+          <w:dstrike w:val="0"/>
+          <w:color w:val="000000" w:themeColor="text2" w:themeTint="FF" w:themeShade="FF"/>
+          <w:sz w:val="22"/>
+          <w:szCs w:val="22"/>
+          <w:u w:val="none"/>
+          <w:vertAlign w:val="baseline"/>
+        </w:rPr>
+      </w:pPr>
+    </w:p>
+    <w:p>
+      <w:pPr>
+        <w:pStyle w:val="normal1"/>
+        <w:keepNext w:val="0"/>
+        <w:keepLines w:val="0"/>
+        <w:pageBreakBefore w:val="0"/>
+        <w:widowControl w:val="1"/>
+        <w:shd w:val="clear" w:color="auto" w:fill="auto"/>
+        <w:spacing w:before="0" w:after="0" w:line="240" w:lineRule="auto"/>
+        <w:ind w:hanging="0"/>
+        <w:jc w:val="both"/>
+        <w:rPr>
+          <w:rFonts w:ascii="Times New Roman" w:hAnsi="Times New Roman" w:eastAsia="Times New Roman" w:cs="Times New Roman"/>
+          <w:i w:val="1"/>
+          <w:iCs w:val="1"/>
+          <w:caps w:val="0"/>
+          <w:smallCaps w:val="0"/>
+          <w:strike w:val="0"/>
+          <w:dstrike w:val="0"/>
+          <w:color w:val="000000" w:themeColor="text2" w:themeTint="FF" w:themeShade="FF"/>
+          <w:sz w:val="22"/>
+          <w:szCs w:val="22"/>
+          <w:u w:val="none"/>
+          <w:vertAlign w:val="baseline"/>
+        </w:rPr>
+      </w:pPr>
+    </w:p>
+    <w:p>
+      <w:pPr>
+        <w:pStyle w:val="normal1"/>
+        <w:keepNext w:val="0"/>
+        <w:keepLines w:val="0"/>
+        <w:pageBreakBefore w:val="0"/>
+        <w:widowControl w:val="1"/>
+        <w:shd w:val="clear" w:color="auto" w:fill="auto"/>
+        <w:spacing w:before="0" w:after="0" w:line="240" w:lineRule="auto"/>
+        <w:ind w:hanging="0"/>
+        <w:jc w:val="both"/>
+        <w:rPr>
+          <w:rFonts w:ascii="Times New Roman" w:hAnsi="Times New Roman" w:eastAsia="Times New Roman" w:cs="Times New Roman"/>
+          <w:i w:val="1"/>
+          <w:iCs w:val="1"/>
+          <w:caps w:val="0"/>
+          <w:smallCaps w:val="0"/>
+          <w:strike w:val="0"/>
+          <w:dstrike w:val="0"/>
+          <w:color w:val="000000" w:themeColor="text2" w:themeTint="FF" w:themeShade="FF"/>
+          <w:sz w:val="22"/>
+          <w:szCs w:val="22"/>
+          <w:u w:val="none"/>
+          <w:vertAlign w:val="baseline"/>
+        </w:rPr>
+      </w:pPr>
+    </w:p>
+    <w:p>
+      <w:pPr>
+        <w:pStyle w:val="normal1"/>
+        <w:keepNext w:val="0"/>
+        <w:keepLines w:val="0"/>
+        <w:pageBreakBefore w:val="0"/>
+        <w:widowControl w:val="1"/>
+        <w:shd w:val="clear" w:color="auto" w:fill="auto"/>
+        <w:spacing w:before="0" w:after="0" w:line="240" w:lineRule="auto"/>
+        <w:ind w:hanging="0"/>
+        <w:jc w:val="both"/>
+        <w:rPr>
+          <w:rFonts w:ascii="Times New Roman" w:hAnsi="Times New Roman" w:eastAsia="Times New Roman" w:cs="Times New Roman"/>
+          <w:i w:val="1"/>
+          <w:iCs w:val="1"/>
+          <w:caps w:val="0"/>
+          <w:smallCaps w:val="0"/>
+          <w:strike w:val="0"/>
+          <w:dstrike w:val="0"/>
+          <w:color w:val="000000" w:themeColor="text2" w:themeTint="FF" w:themeShade="FF"/>
+          <w:sz w:val="22"/>
+          <w:szCs w:val="22"/>
+          <w:u w:val="none"/>
+          <w:vertAlign w:val="baseline"/>
+        </w:rPr>
+      </w:pPr>
+    </w:p>
+    <w:p xmlns:wp14="http://schemas.microsoft.com/office/word/2010/wordml" wp14:textId="4C9B65B3">
       <w:pPr>
         <w:pStyle w:val="Heading1"/>
-        <w:rPr/>
       </w:pPr>
       <w:bookmarkStart w:name="_heading=h.xd521ko0z6gm" w:id="14"/>
       <w:bookmarkEnd w:id="14"/>
@@ -11479,8 +12480,8 @@
 
 <file path=word/numbering.xml><?xml version="1.0" encoding="utf-8"?>
 <w:numbering xmlns:w="http://schemas.openxmlformats.org/wordprocessingml/2006/main">
-  <w:abstractNum xmlns:w="http://schemas.openxmlformats.org/wordprocessingml/2006/main" w:abstractNumId="1">
-    <w:nsid w:val="2ab3fd82"/>
+  <w:abstractNum xmlns:w="http://schemas.openxmlformats.org/wordprocessingml/2006/main" w:abstractNumId="4">
+    <w:nsid w:val="59ca5034"/>
     <w:multiLevelType xmlns:w="http://schemas.openxmlformats.org/wordprocessingml/2006/main" w:val="hybridMultilevel"/>
     <w:lvl xmlns:w="http://schemas.openxmlformats.org/wordprocessingml/2006/main" w:ilvl="0">
       <w:start w:val="1"/>
@@ -11591,6 +12592,351 @@
       </w:rPr>
     </w:lvl>
   </w:abstractNum>
+  <w:abstractNum xmlns:w="http://schemas.openxmlformats.org/wordprocessingml/2006/main" w:abstractNumId="3">
+    <w:nsid w:val="dad2e7c"/>
+    <w:multiLevelType xmlns:w="http://schemas.openxmlformats.org/wordprocessingml/2006/main" w:val="hybridMultilevel"/>
+    <w:lvl xmlns:w="http://schemas.openxmlformats.org/wordprocessingml/2006/main" w:ilvl="0">
+      <w:start w:val="1"/>
+      <w:numFmt w:val="bullet"/>
+      <w:lvlText w:val=""/>
+      <w:lvlJc w:val="left"/>
+      <w:pPr>
+        <w:ind w:left="720" w:hanging="360"/>
+      </w:pPr>
+      <w:rPr>
+        <w:rFonts w:hint="default" w:ascii="Symbol" w:hAnsi="Symbol"/>
+      </w:rPr>
+    </w:lvl>
+    <w:lvl xmlns:w="http://schemas.openxmlformats.org/wordprocessingml/2006/main" w:ilvl="1">
+      <w:start w:val="1"/>
+      <w:numFmt w:val="bullet"/>
+      <w:lvlText w:val="o"/>
+      <w:lvlJc w:val="left"/>
+      <w:pPr>
+        <w:ind w:left="1440" w:hanging="360"/>
+      </w:pPr>
+      <w:rPr>
+        <w:rFonts w:hint="default" w:ascii="Courier New" w:hAnsi="Courier New"/>
+      </w:rPr>
+    </w:lvl>
+    <w:lvl xmlns:w="http://schemas.openxmlformats.org/wordprocessingml/2006/main" w:ilvl="2">
+      <w:start w:val="1"/>
+      <w:numFmt w:val="bullet"/>
+      <w:lvlText w:val=""/>
+      <w:lvlJc w:val="left"/>
+      <w:pPr>
+        <w:ind w:left="2160" w:hanging="360"/>
+      </w:pPr>
+      <w:rPr>
+        <w:rFonts w:hint="default" w:ascii="Wingdings" w:hAnsi="Wingdings"/>
+      </w:rPr>
+    </w:lvl>
+    <w:lvl xmlns:w="http://schemas.openxmlformats.org/wordprocessingml/2006/main" w:ilvl="3">
+      <w:start w:val="1"/>
+      <w:numFmt w:val="bullet"/>
+      <w:lvlText w:val=""/>
+      <w:lvlJc w:val="left"/>
+      <w:pPr>
+        <w:ind w:left="2880" w:hanging="360"/>
+      </w:pPr>
+      <w:rPr>
+        <w:rFonts w:hint="default" w:ascii="Symbol" w:hAnsi="Symbol"/>
+      </w:rPr>
+    </w:lvl>
+    <w:lvl xmlns:w="http://schemas.openxmlformats.org/wordprocessingml/2006/main" w:ilvl="4">
+      <w:start w:val="1"/>
+      <w:numFmt w:val="bullet"/>
+      <w:lvlText w:val="o"/>
+      <w:lvlJc w:val="left"/>
+      <w:pPr>
+        <w:ind w:left="3600" w:hanging="360"/>
+      </w:pPr>
+      <w:rPr>
+        <w:rFonts w:hint="default" w:ascii="Courier New" w:hAnsi="Courier New"/>
+      </w:rPr>
+    </w:lvl>
+    <w:lvl xmlns:w="http://schemas.openxmlformats.org/wordprocessingml/2006/main" w:ilvl="5">
+      <w:start w:val="1"/>
+      <w:numFmt w:val="bullet"/>
+      <w:lvlText w:val=""/>
+      <w:lvlJc w:val="left"/>
+      <w:pPr>
+        <w:ind w:left="4320" w:hanging="360"/>
+      </w:pPr>
+      <w:rPr>
+        <w:rFonts w:hint="default" w:ascii="Wingdings" w:hAnsi="Wingdings"/>
+      </w:rPr>
+    </w:lvl>
+    <w:lvl xmlns:w="http://schemas.openxmlformats.org/wordprocessingml/2006/main" w:ilvl="6">
+      <w:start w:val="1"/>
+      <w:numFmt w:val="bullet"/>
+      <w:lvlText w:val=""/>
+      <w:lvlJc w:val="left"/>
+      <w:pPr>
+        <w:ind w:left="5040" w:hanging="360"/>
+      </w:pPr>
+      <w:rPr>
+        <w:rFonts w:hint="default" w:ascii="Symbol" w:hAnsi="Symbol"/>
+      </w:rPr>
+    </w:lvl>
+    <w:lvl xmlns:w="http://schemas.openxmlformats.org/wordprocessingml/2006/main" w:ilvl="7">
+      <w:start w:val="1"/>
+      <w:numFmt w:val="bullet"/>
+      <w:lvlText w:val="o"/>
+      <w:lvlJc w:val="left"/>
+      <w:pPr>
+        <w:ind w:left="5760" w:hanging="360"/>
+      </w:pPr>
+      <w:rPr>
+        <w:rFonts w:hint="default" w:ascii="Courier New" w:hAnsi="Courier New"/>
+      </w:rPr>
+    </w:lvl>
+    <w:lvl xmlns:w="http://schemas.openxmlformats.org/wordprocessingml/2006/main" w:ilvl="8">
+      <w:start w:val="1"/>
+      <w:numFmt w:val="bullet"/>
+      <w:lvlText w:val=""/>
+      <w:lvlJc w:val="left"/>
+      <w:pPr>
+        <w:ind w:left="6480" w:hanging="360"/>
+      </w:pPr>
+      <w:rPr>
+        <w:rFonts w:hint="default" w:ascii="Wingdings" w:hAnsi="Wingdings"/>
+      </w:rPr>
+    </w:lvl>
+  </w:abstractNum>
+  <w:abstractNum xmlns:w="http://schemas.openxmlformats.org/wordprocessingml/2006/main" w:abstractNumId="2">
+    <w:nsid w:val="10857e79"/>
+    <w:multiLevelType xmlns:w="http://schemas.openxmlformats.org/wordprocessingml/2006/main" w:val="hybridMultilevel"/>
+    <w:lvl xmlns:w="http://schemas.openxmlformats.org/wordprocessingml/2006/main" w:ilvl="0">
+      <w:start w:val="1"/>
+      <w:numFmt w:val="bullet"/>
+      <w:lvlText w:val=""/>
+      <w:lvlJc w:val="left"/>
+      <w:pPr>
+        <w:ind w:left="720" w:hanging="360"/>
+      </w:pPr>
+      <w:rPr>
+        <w:rFonts w:hint="default" w:ascii="Symbol" w:hAnsi="Symbol"/>
+      </w:rPr>
+    </w:lvl>
+    <w:lvl xmlns:w="http://schemas.openxmlformats.org/wordprocessingml/2006/main" w:ilvl="1">
+      <w:start w:val="1"/>
+      <w:numFmt w:val="bullet"/>
+      <w:lvlText w:val="o"/>
+      <w:lvlJc w:val="left"/>
+      <w:pPr>
+        <w:ind w:left="1440" w:hanging="360"/>
+      </w:pPr>
+      <w:rPr>
+        <w:rFonts w:hint="default" w:ascii="Courier New" w:hAnsi="Courier New"/>
+      </w:rPr>
+    </w:lvl>
+    <w:lvl xmlns:w="http://schemas.openxmlformats.org/wordprocessingml/2006/main" w:ilvl="2">
+      <w:start w:val="1"/>
+      <w:numFmt w:val="bullet"/>
+      <w:lvlText w:val=""/>
+      <w:lvlJc w:val="left"/>
+      <w:pPr>
+        <w:ind w:left="2160" w:hanging="360"/>
+      </w:pPr>
+      <w:rPr>
+        <w:rFonts w:hint="default" w:ascii="Wingdings" w:hAnsi="Wingdings"/>
+      </w:rPr>
+    </w:lvl>
+    <w:lvl xmlns:w="http://schemas.openxmlformats.org/wordprocessingml/2006/main" w:ilvl="3">
+      <w:start w:val="1"/>
+      <w:numFmt w:val="bullet"/>
+      <w:lvlText w:val=""/>
+      <w:lvlJc w:val="left"/>
+      <w:pPr>
+        <w:ind w:left="2880" w:hanging="360"/>
+      </w:pPr>
+      <w:rPr>
+        <w:rFonts w:hint="default" w:ascii="Symbol" w:hAnsi="Symbol"/>
+      </w:rPr>
+    </w:lvl>
+    <w:lvl xmlns:w="http://schemas.openxmlformats.org/wordprocessingml/2006/main" w:ilvl="4">
+      <w:start w:val="1"/>
+      <w:numFmt w:val="bullet"/>
+      <w:lvlText w:val="o"/>
+      <w:lvlJc w:val="left"/>
+      <w:pPr>
+        <w:ind w:left="3600" w:hanging="360"/>
+      </w:pPr>
+      <w:rPr>
+        <w:rFonts w:hint="default" w:ascii="Courier New" w:hAnsi="Courier New"/>
+      </w:rPr>
+    </w:lvl>
+    <w:lvl xmlns:w="http://schemas.openxmlformats.org/wordprocessingml/2006/main" w:ilvl="5">
+      <w:start w:val="1"/>
+      <w:numFmt w:val="bullet"/>
+      <w:lvlText w:val=""/>
+      <w:lvlJc w:val="left"/>
+      <w:pPr>
+        <w:ind w:left="4320" w:hanging="360"/>
+      </w:pPr>
+      <w:rPr>
+        <w:rFonts w:hint="default" w:ascii="Wingdings" w:hAnsi="Wingdings"/>
+      </w:rPr>
+    </w:lvl>
+    <w:lvl xmlns:w="http://schemas.openxmlformats.org/wordprocessingml/2006/main" w:ilvl="6">
+      <w:start w:val="1"/>
+      <w:numFmt w:val="bullet"/>
+      <w:lvlText w:val=""/>
+      <w:lvlJc w:val="left"/>
+      <w:pPr>
+        <w:ind w:left="5040" w:hanging="360"/>
+      </w:pPr>
+      <w:rPr>
+        <w:rFonts w:hint="default" w:ascii="Symbol" w:hAnsi="Symbol"/>
+      </w:rPr>
+    </w:lvl>
+    <w:lvl xmlns:w="http://schemas.openxmlformats.org/wordprocessingml/2006/main" w:ilvl="7">
+      <w:start w:val="1"/>
+      <w:numFmt w:val="bullet"/>
+      <w:lvlText w:val="o"/>
+      <w:lvlJc w:val="left"/>
+      <w:pPr>
+        <w:ind w:left="5760" w:hanging="360"/>
+      </w:pPr>
+      <w:rPr>
+        <w:rFonts w:hint="default" w:ascii="Courier New" w:hAnsi="Courier New"/>
+      </w:rPr>
+    </w:lvl>
+    <w:lvl xmlns:w="http://schemas.openxmlformats.org/wordprocessingml/2006/main" w:ilvl="8">
+      <w:start w:val="1"/>
+      <w:numFmt w:val="bullet"/>
+      <w:lvlText w:val=""/>
+      <w:lvlJc w:val="left"/>
+      <w:pPr>
+        <w:ind w:left="6480" w:hanging="360"/>
+      </w:pPr>
+      <w:rPr>
+        <w:rFonts w:hint="default" w:ascii="Wingdings" w:hAnsi="Wingdings"/>
+      </w:rPr>
+    </w:lvl>
+  </w:abstractNum>
+  <w:abstractNum xmlns:w="http://schemas.openxmlformats.org/wordprocessingml/2006/main" w:abstractNumId="1">
+    <w:nsid w:val="2ab3fd82"/>
+    <w:multiLevelType xmlns:w="http://schemas.openxmlformats.org/wordprocessingml/2006/main" w:val="hybridMultilevel"/>
+    <w:lvl xmlns:w="http://schemas.openxmlformats.org/wordprocessingml/2006/main" w:ilvl="0">
+      <w:start w:val="1"/>
+      <w:numFmt w:val="bullet"/>
+      <w:lvlText w:val=""/>
+      <w:lvlJc w:val="left"/>
+      <w:pPr>
+        <w:ind w:left="720" w:hanging="360"/>
+      </w:pPr>
+      <w:rPr>
+        <w:rFonts w:hint="default" w:ascii="Symbol" w:hAnsi="Symbol"/>
+      </w:rPr>
+    </w:lvl>
+    <w:lvl xmlns:w="http://schemas.openxmlformats.org/wordprocessingml/2006/main" w:ilvl="1">
+      <w:start w:val="1"/>
+      <w:numFmt w:val="bullet"/>
+      <w:lvlText w:val="o"/>
+      <w:lvlJc w:val="left"/>
+      <w:pPr>
+        <w:ind w:left="1440" w:hanging="360"/>
+      </w:pPr>
+      <w:rPr>
+        <w:rFonts w:hint="default" w:ascii="Courier New" w:hAnsi="Courier New"/>
+      </w:rPr>
+    </w:lvl>
+    <w:lvl xmlns:w="http://schemas.openxmlformats.org/wordprocessingml/2006/main" w:ilvl="2">
+      <w:start w:val="1"/>
+      <w:numFmt w:val="bullet"/>
+      <w:lvlText w:val=""/>
+      <w:lvlJc w:val="left"/>
+      <w:pPr>
+        <w:ind w:left="2160" w:hanging="360"/>
+      </w:pPr>
+      <w:rPr>
+        <w:rFonts w:hint="default" w:ascii="Wingdings" w:hAnsi="Wingdings"/>
+      </w:rPr>
+    </w:lvl>
+    <w:lvl xmlns:w="http://schemas.openxmlformats.org/wordprocessingml/2006/main" w:ilvl="3">
+      <w:start w:val="1"/>
+      <w:numFmt w:val="bullet"/>
+      <w:lvlText w:val=""/>
+      <w:lvlJc w:val="left"/>
+      <w:pPr>
+        <w:ind w:left="2880" w:hanging="360"/>
+      </w:pPr>
+      <w:rPr>
+        <w:rFonts w:hint="default" w:ascii="Symbol" w:hAnsi="Symbol"/>
+      </w:rPr>
+    </w:lvl>
+    <w:lvl xmlns:w="http://schemas.openxmlformats.org/wordprocessingml/2006/main" w:ilvl="4">
+      <w:start w:val="1"/>
+      <w:numFmt w:val="bullet"/>
+      <w:lvlText w:val="o"/>
+      <w:lvlJc w:val="left"/>
+      <w:pPr>
+        <w:ind w:left="3600" w:hanging="360"/>
+      </w:pPr>
+      <w:rPr>
+        <w:rFonts w:hint="default" w:ascii="Courier New" w:hAnsi="Courier New"/>
+      </w:rPr>
+    </w:lvl>
+    <w:lvl xmlns:w="http://schemas.openxmlformats.org/wordprocessingml/2006/main" w:ilvl="5">
+      <w:start w:val="1"/>
+      <w:numFmt w:val="bullet"/>
+      <w:lvlText w:val=""/>
+      <w:lvlJc w:val="left"/>
+      <w:pPr>
+        <w:ind w:left="4320" w:hanging="360"/>
+      </w:pPr>
+      <w:rPr>
+        <w:rFonts w:hint="default" w:ascii="Wingdings" w:hAnsi="Wingdings"/>
+      </w:rPr>
+    </w:lvl>
+    <w:lvl xmlns:w="http://schemas.openxmlformats.org/wordprocessingml/2006/main" w:ilvl="6">
+      <w:start w:val="1"/>
+      <w:numFmt w:val="bullet"/>
+      <w:lvlText w:val=""/>
+      <w:lvlJc w:val="left"/>
+      <w:pPr>
+        <w:ind w:left="5040" w:hanging="360"/>
+      </w:pPr>
+      <w:rPr>
+        <w:rFonts w:hint="default" w:ascii="Symbol" w:hAnsi="Symbol"/>
+      </w:rPr>
+    </w:lvl>
+    <w:lvl xmlns:w="http://schemas.openxmlformats.org/wordprocessingml/2006/main" w:ilvl="7">
+      <w:start w:val="1"/>
+      <w:numFmt w:val="bullet"/>
+      <w:lvlText w:val="o"/>
+      <w:lvlJc w:val="left"/>
+      <w:pPr>
+        <w:ind w:left="5760" w:hanging="360"/>
+      </w:pPr>
+      <w:rPr>
+        <w:rFonts w:hint="default" w:ascii="Courier New" w:hAnsi="Courier New"/>
+      </w:rPr>
+    </w:lvl>
+    <w:lvl xmlns:w="http://schemas.openxmlformats.org/wordprocessingml/2006/main" w:ilvl="8">
+      <w:start w:val="1"/>
+      <w:numFmt w:val="bullet"/>
+      <w:lvlText w:val=""/>
+      <w:lvlJc w:val="left"/>
+      <w:pPr>
+        <w:ind w:left="6480" w:hanging="360"/>
+      </w:pPr>
+      <w:rPr>
+        <w:rFonts w:hint="default" w:ascii="Wingdings" w:hAnsi="Wingdings"/>
+      </w:rPr>
+    </w:lvl>
+  </w:abstractNum>
+  <w:num w:numId="4">
+    <w:abstractNumId w:val="4"/>
+  </w:num>
+  <w:num w:numId="3">
+    <w:abstractNumId w:val="3"/>
+  </w:num>
+  <w:num w:numId="2">
+    <w:abstractNumId w:val="2"/>
+  </w:num>
   <w:num w:numId="1">
     <w:abstractNumId w:val="1"/>
   </w:num>

</xml_diff>